<commit_message>
Remove Netlify deployment integration
</commit_message>
<xml_diff>
--- a/output/word/ACT-11-SiCoSe.docx
+++ b/output/word/ACT-11-SiCoSe.docx
@@ -1164,7 +1164,7 @@
           <w:color w:val="000000" w:themeColor="text1"/>
           <w:sz w:val="21"/>
         </w:rPr>
-        <w:t xml:space="preserve">No usar Netlify; la operación productiva documentada queda sobre </w:t>
+        <w:t xml:space="preserve">La operación productiva documentada se ejecuta sobre </w:t>
       </w:r>
       <w:proofErr w:type="spellStart"/>
       <w:r>
@@ -3269,7 +3269,7 @@
                 <w:color w:val="000000" w:themeColor="text1"/>
                 <w:sz w:val="17"/>
               </w:rPr>
-              <w:t xml:space="preserve">/no Netlify, proxy </w:t>
+              <w:t xml:space="preserve">, proxy </w:t>
             </w:r>
             <w:proofErr w:type="spellStart"/>
             <w:r>
@@ -5453,7 +5453,7 @@
         <w:rPr>
           <w:color w:val="000000" w:themeColor="text1"/>
         </w:rPr>
-        <w:t xml:space="preserve"> como hosting de frontend y Render como backend operativo; no se usó Netlify por decisión explícita.</w:t>
+        <w:t xml:space="preserve"> como hosting de frontend y Render como backend operativo.</w:t>
       </w:r>
     </w:p>
     <w:p>

</xml_diff>